<commit_message>
OV02 v2: build ratified cold acute-blood-loss-anemia plant
- task_data.py T2: worksheet proposes 'Acute blood loss anemia (D62)' (basis Hgb 9.8).
- build_goldens.py OV02: golden declines it (stable Hgb 9.8, anemia of CKD, no
  bleeding); codes anemia in CKD only. Retains the warm osteo/pressure declines.
- build_task_packages.py OV02 grader: Section A must-decline + Section C central
  failure now lead with the cold anemia upcode; forecast bimodal.
- Rebuilt task file + golden + grader; verify_ondina green (60 docx); worksheet
  surface neutral, no telegraph; golden self-satisfies anchors.
- Locked OV02-v2-pilot-preregistration.md; recalibration plan marked ratified.
</commit_message>
<xml_diff>
--- a/worlds/ondina-vasquell/phase-3-build-task-artifacts/platform/task2/current/golden-OV02-v1.docx
+++ b/worlds/ondina-vasquell/phase-3-build-task-artifacts/platform/task2/current/golden-OV02-v1.docx
@@ -1140,6 +1140,77 @@
                 <w:color w:val="232830"/>
                 <w:sz w:val="16"/>
               </w:rPr>
+              <w:t>Acute blood loss anemia</w:t>
+            </w:r>
+          </w:p>
+        </w:tc>
+        <w:tc>
+          <w:tcPr>
+            <w:tcW w:type="dxa" w:w="2592"/>
+          </w:tcPr>
+          <w:p>
+            <w:r>
+              <w:rPr>
+                <w:rFonts w:ascii="Arial" w:hAnsi="Arial"/>
+                <w:b w:val="0"/>
+                <w:i w:val="0"/>
+                <w:color w:val="232830"/>
+                <w:sz w:val="16"/>
+              </w:rPr>
+              <w:t>Not assigned</w:t>
+            </w:r>
+          </w:p>
+        </w:tc>
+        <w:tc>
+          <w:tcPr>
+            <w:tcW w:type="dxa" w:w="2592"/>
+          </w:tcPr>
+          <w:p>
+            <w:r>
+              <w:rPr>
+                <w:rFonts w:ascii="Arial" w:hAnsi="Arial"/>
+                <w:b w:val="0"/>
+                <w:i w:val="0"/>
+                <w:color w:val="232830"/>
+                <w:sz w:val="16"/>
+              </w:rPr>
+              <w:t>n/a</w:t>
+            </w:r>
+          </w:p>
+        </w:tc>
+        <w:tc>
+          <w:tcPr>
+            <w:tcW w:type="dxa" w:w="2592"/>
+          </w:tcPr>
+          <w:p>
+            <w:r>
+              <w:rPr>
+                <w:rFonts w:ascii="Arial" w:hAnsi="Arial"/>
+                <w:b w:val="0"/>
+                <w:i w:val="0"/>
+                <w:color w:val="232830"/>
+                <w:sz w:val="16"/>
+              </w:rPr>
+              <w:t>Decline. The hemoglobin is stable at 9.8 across the admission with no documented bleeding or transfusion; this is anemia of chronic kidney disease, not acute blood loss. Code anemia in chronic kidney disease only.</w:t>
+            </w:r>
+          </w:p>
+        </w:tc>
+      </w:tr>
+      <w:tr>
+        <w:tc>
+          <w:tcPr>
+            <w:tcW w:type="dxa" w:w="2592"/>
+            <w:shd w:val="clear" w:fill="EDF2FA"/>
+          </w:tcPr>
+          <w:p>
+            <w:r>
+              <w:rPr>
+                <w:rFonts w:ascii="Arial" w:hAnsi="Arial"/>
+                <w:b w:val="0"/>
+                <w:i w:val="0"/>
+                <w:color w:val="232830"/>
+                <w:sz w:val="16"/>
+              </w:rPr>
               <w:t>Peripheral arterial disease</w:t>
             </w:r>
           </w:p>
@@ -1147,6 +1218,7 @@
         <w:tc>
           <w:tcPr>
             <w:tcW w:type="dxa" w:w="2592"/>
+            <w:shd w:val="clear" w:fill="EDF2FA"/>
           </w:tcPr>
           <w:p>
             <w:r>
@@ -1164,6 +1236,7 @@
         <w:tc>
           <w:tcPr>
             <w:tcW w:type="dxa" w:w="2592"/>
+            <w:shd w:val="clear" w:fill="EDF2FA"/>
           </w:tcPr>
           <w:p>
             <w:r>
@@ -1181,6 +1254,7 @@
         <w:tc>
           <w:tcPr>
             <w:tcW w:type="dxa" w:w="2592"/>
+            <w:shd w:val="clear" w:fill="EDF2FA"/>
           </w:tcPr>
           <w:p>
             <w:r>

</xml_diff>

<commit_message>
OV02 v3 built: procedure-depth trap (Alexander-ratified) + save-to-file prompt
- Worksheet proposes 'Excisional debridement to muscle and fascia (deep)';
  golden attests subcutaneous-depth only (no bone exposed/palpable, path no bone);
  grader central failure = over-attesting debridement depth / unsupported severity.
- Anemia/pressure/osteo kept as background rejects.
- Prompt now saves to /tmp/outputs/physician_coding_attestation.txt (DO-NOT-REPEAT #18).
- verify_ondina green (60 docx); locked OV02-v3 prereg; plan + status updated.
</commit_message>
<xml_diff>
--- a/worlds/ondina-vasquell/phase-3-build-task-artifacts/platform/task2/current/golden-OV02-v1.docx
+++ b/worlds/ondina-vasquell/phase-3-build-task-artifacts/platform/task2/current/golden-OV02-v1.docx
@@ -1211,7 +1211,7 @@
                 <w:color w:val="232830"/>
                 <w:sz w:val="16"/>
               </w:rPr>
-              <w:t>Peripheral arterial disease</w:t>
+              <w:t>Debridement depth</w:t>
             </w:r>
           </w:p>
         </w:tc>
@@ -1229,7 +1229,7 @@
                 <w:color w:val="232830"/>
                 <w:sz w:val="16"/>
               </w:rPr>
-              <w:t>PAD</w:t>
+              <w:t>Excisional debridement of skin and subcutaneous tissue only</w:t>
             </w:r>
           </w:p>
         </w:tc>
@@ -1247,6 +1247,77 @@
                 <w:color w:val="232830"/>
                 <w:sz w:val="16"/>
               </w:rPr>
+              <w:t>n/a</w:t>
+            </w:r>
+          </w:p>
+        </w:tc>
+        <w:tc>
+          <w:tcPr>
+            <w:tcW w:type="dxa" w:w="2592"/>
+            <w:shd w:val="clear" w:fill="EDF2FA"/>
+          </w:tcPr>
+          <w:p>
+            <w:r>
+              <w:rPr>
+                <w:rFonts w:ascii="Arial" w:hAnsi="Arial"/>
+                <w:b w:val="0"/>
+                <w:i w:val="0"/>
+                <w:color w:val="232830"/>
+                <w:sz w:val="16"/>
+              </w:rPr>
+              <w:t>Decline muscle, fascia, tendon, or bone depth. The operative note documents bedside sharp debridement of nonviable soft tissue to a granulating base with no exposed or palpable bone, and pathology found no bone in the deep soft tissue specimen. The deep soft tissue specimen describes what was sent, not the excision plane. Attest excisional debridement at the subcutaneous level only; do not support a deeper surgical severity tier.</w:t>
+            </w:r>
+          </w:p>
+        </w:tc>
+      </w:tr>
+      <w:tr>
+        <w:tc>
+          <w:tcPr>
+            <w:tcW w:type="dxa" w:w="2592"/>
+          </w:tcPr>
+          <w:p>
+            <w:r>
+              <w:rPr>
+                <w:rFonts w:ascii="Arial" w:hAnsi="Arial"/>
+                <w:b w:val="0"/>
+                <w:i w:val="0"/>
+                <w:color w:val="232830"/>
+                <w:sz w:val="16"/>
+              </w:rPr>
+              <w:t>Peripheral arterial disease</w:t>
+            </w:r>
+          </w:p>
+        </w:tc>
+        <w:tc>
+          <w:tcPr>
+            <w:tcW w:type="dxa" w:w="2592"/>
+          </w:tcPr>
+          <w:p>
+            <w:r>
+              <w:rPr>
+                <w:rFonts w:ascii="Arial" w:hAnsi="Arial"/>
+                <w:b w:val="0"/>
+                <w:i w:val="0"/>
+                <w:color w:val="232830"/>
+                <w:sz w:val="16"/>
+              </w:rPr>
+              <w:t>PAD</w:t>
+            </w:r>
+          </w:p>
+        </w:tc>
+        <w:tc>
+          <w:tcPr>
+            <w:tcW w:type="dxa" w:w="2592"/>
+          </w:tcPr>
+          <w:p>
+            <w:r>
+              <w:rPr>
+                <w:rFonts w:ascii="Arial" w:hAnsi="Arial"/>
+                <w:b w:val="0"/>
+                <w:i w:val="0"/>
+                <w:color w:val="232830"/>
+                <w:sz w:val="16"/>
+              </w:rPr>
               <w:t>Yes</w:t>
             </w:r>
           </w:p>
@@ -1254,7 +1325,6 @@
         <w:tc>
           <w:tcPr>
             <w:tcW w:type="dxa" w:w="2592"/>
-            <w:shd w:val="clear" w:fill="EDF2FA"/>
           </w:tcPr>
           <w:p>
             <w:r>

</xml_diff>

<commit_message>
OV02 v5 (final-packet closure lever) piloted: CEILINGED 0.95-0.98, mean 96.6. 5th coding ceiling. Anti-hedge lever failed - model produces one signable version + kills Pathway A every run. Results record written; coding genre conclusively model-strong.
</commit_message>
<xml_diff>
--- a/worlds/ondina-vasquell/phase-3-build-task-artifacts/platform/task2/current/golden-OV02-v1.docx
+++ b/worlds/ondina-vasquell/phase-3-build-task-artifacts/platform/task2/current/golden-OV02-v1.docx
@@ -568,6 +568,36 @@
           <w:color w:val="4472C4"/>
           <w:sz w:val="20"/>
         </w:rPr>
+        <w:t>FINAL PATHWAY FOR SIGNATURE</w:t>
+      </w:r>
+    </w:p>
+    <w:p>
+      <w:r>
+        <w:rPr>
+          <w:rFonts w:ascii="Arial" w:hAnsi="Arial"/>
+          <w:b w:val="0"/>
+          <w:i w:val="0"/>
+          <w:color w:val="232830"/>
+          <w:sz w:val="19"/>
+        </w:rPr>
+        <w:t>I have reviewed the HIM final coding attestation packet. I am signing one final pathway only. Pathway B is the correct pathway. Pathway A is not attested and should not remain available for signature, default billing, or coder selection.</w:t>
+      </w:r>
+    </w:p>
+    <w:p>
+      <w:pPr>
+        <w:spacing w:before="180" w:after="60"/>
+        <w:pBdr>
+          <w:bottom w:val="single" w:sz="6" w:color="C9D4EA" w:space="2"/>
+        </w:pBdr>
+      </w:pPr>
+      <w:r>
+        <w:rPr>
+          <w:rFonts w:ascii="Arial" w:hAnsi="Arial"/>
+          <w:b/>
+          <w:i w:val="0"/>
+          <w:color w:val="4472C4"/>
+          <w:sz w:val="20"/>
+        </w:rPr>
         <w:t>PRINCIPAL DIAGNOSIS</w:t>
       </w:r>
     </w:p>
@@ -580,7 +610,7 @@
           <w:color w:val="232830"/>
           <w:sz w:val="19"/>
         </w:rPr>
-        <w:t>Limb-threatening left diabetic foot infection with deep soft tissue involvement. Under the inpatient rule the principal diagnosis is the condition chiefly responsible for occasioning the admission, which is the foot infection she presented and was admitted for. I do not attest the worksheet's acute kidney injury principal: the acute kidney injury on chronic kidney disease is a concurrent condition managed during the stay, not the reason for admission, so it is a secondary diagnosis and not the principal. The encounter groups to the diabetic foot infection family, not the renal failure family.</w:t>
+        <w:t>Limb-threatening left diabetic foot infection with deep soft tissue involvement. Under the inpatient rule, the principal diagnosis is the condition chiefly responsible for occasioning the admission. Mrs. Vasquell presented and was admitted for the worsening draining left forefoot diabetic ulcer with surrounding cellulitis and deep soft tissue infection. I do not attest Pathway A's acute kidney injury or acute renal failure principal. The acute kidney injury on chronic kidney disease is a concurrent condition managed during the stay, not the condition chiefly responsible for the admission, so it is a secondary diagnosis and not the principal. The encounter groups to the diabetic foot infection or cellulitis family, not the renal failure family.</w:t>
       </w:r>
     </w:p>
     <w:p>
@@ -903,7 +933,7 @@
                 <w:color w:val="232830"/>
                 <w:sz w:val="16"/>
               </w:rPr>
-              <w:t>Attest the foot-infection DRG family. The worksheet's renal failure family and its CC/MCC tier are not attested, because the acute kidney injury is not the principal diagnosis.</w:t>
+              <w:t>Attest the foot-infection DRG family. Pathway A's renal failure family and its CC/MCC tier are not attested, because the acute kidney injury is not the principal diagnosis.</w:t>
             </w:r>
           </w:p>
         </w:tc>
@@ -1207,7 +1237,7 @@
           <w:color w:val="232830"/>
           <w:sz w:val="19"/>
         </w:rPr>
-        <w:t>I attest only to what the treating record establishes and sequence the principal diagnosis to the condition that occasioned the admission. I do not adopt the worksheet's acuity-forward principal sequencing or its renal failure DRG.</w:t>
+        <w:t>I attest only to what the treating record establishes and sequence the principal diagnosis to the condition that occasioned the admission. I do not adopt Pathway A, do not leave it pending for HIM choice, and do not preserve the renal failure DRG as an alternate signable pathway.</w:t>
       </w:r>
     </w:p>
     <w:p>

</xml_diff>